<commit_message>
docs: correct list numbering and generate PDF logic explanation
</commit_message>
<xml_diff>
--- a/docs/allocation_logic_explanation.docx
+++ b/docs/allocation_logic_explanation.docx
@@ -4,7 +4,7 @@
   <w:body>
     <w:p>
       <w:pPr>
-        <w:spacing w:before="240" w:after="240"/>
+        <w:spacing w:before="480" w:after="360"/>
         <w:jc w:val="center"/>
       </w:pPr>
       <w:r>
@@ -27,18 +27,20 @@
     </w:p>
     <w:p>
       <w:pPr>
+        <w:spacing w:before="240" w:after="240"/>
         <w:jc w:val="center"/>
       </w:pPr>
       <w:r>
         <w:rPr>
-          <w:color w:val="C8C8C8"/>
+          <w:color w:val="DCDCDC"/>
         </w:rPr>
-        <w:t>————————————————————————————————————————</w:t>
+        <w:t>——————————————————————————————————————————————————</w:t>
       </w:r>
     </w:p>
     <w:p>
       <w:pPr>
-        <w:spacing w:before="360" w:after="120"/>
+        <w:keepNext/>
+        <w:spacing w:before="360" w:after="160"/>
       </w:pPr>
       <w:r>
         <w:rPr>
@@ -52,9 +54,16 @@
     </w:p>
     <w:p>
       <w:pPr>
-        <w:pStyle w:val="ListNumber"/>
         <w:spacing w:after="80"/>
+        <w:ind w:left="576"/>
       </w:pPr>
+      <w:r>
+        <w:rPr>
+          <w:b/>
+          <w:color w:val="053364"/>
+        </w:rPr>
+        <w:t xml:space="preserve">1.  </w:t>
+      </w:r>
       <w:r/>
       <w:r>
         <w:rPr>
@@ -68,9 +77,16 @@
     </w:p>
     <w:p>
       <w:pPr>
-        <w:pStyle w:val="ListNumber"/>
         <w:spacing w:after="80"/>
+        <w:ind w:left="576"/>
       </w:pPr>
+      <w:r>
+        <w:rPr>
+          <w:b/>
+          <w:color w:val="053364"/>
+        </w:rPr>
+        <w:t xml:space="preserve">2.  </w:t>
+      </w:r>
       <w:r/>
       <w:r>
         <w:rPr>
@@ -84,9 +100,16 @@
     </w:p>
     <w:p>
       <w:pPr>
-        <w:pStyle w:val="ListBullet"/>
         <w:spacing w:after="80"/>
+        <w:ind w:left="576"/>
       </w:pPr>
+      <w:r>
+        <w:rPr>
+          <w:b/>
+          <w:color w:val="0F172A"/>
+        </w:rPr>
+        <w:t xml:space="preserve">•  </w:t>
+      </w:r>
       <w:r/>
       <w:r>
         <w:rPr>
@@ -100,9 +123,16 @@
     </w:p>
     <w:p>
       <w:pPr>
-        <w:pStyle w:val="ListBullet"/>
         <w:spacing w:after="80"/>
+        <w:ind w:left="576"/>
       </w:pPr>
+      <w:r>
+        <w:rPr>
+          <w:b/>
+          <w:color w:val="0F172A"/>
+        </w:rPr>
+        <w:t xml:space="preserve">•  </w:t>
+      </w:r>
       <w:r/>
       <w:r>
         <w:rPr>
@@ -116,18 +146,20 @@
     </w:p>
     <w:p>
       <w:pPr>
+        <w:spacing w:before="240" w:after="240"/>
         <w:jc w:val="center"/>
       </w:pPr>
       <w:r>
         <w:rPr>
-          <w:color w:val="C8C8C8"/>
+          <w:color w:val="DCDCDC"/>
         </w:rPr>
-        <w:t>————————————————————————————————————————</w:t>
+        <w:t>——————————————————————————————————————————————————</w:t>
       </w:r>
     </w:p>
     <w:p>
       <w:pPr>
-        <w:spacing w:before="360" w:after="120"/>
+        <w:keepNext/>
+        <w:spacing w:before="360" w:after="160"/>
       </w:pPr>
       <w:r>
         <w:rPr>
@@ -141,9 +173,16 @@
     </w:p>
     <w:p>
       <w:pPr>
-        <w:pStyle w:val="ListNumber"/>
         <w:spacing w:after="80"/>
+        <w:ind w:left="576"/>
       </w:pPr>
+      <w:r>
+        <w:rPr>
+          <w:b/>
+          <w:color w:val="053364"/>
+        </w:rPr>
+        <w:t xml:space="preserve">1.  </w:t>
+      </w:r>
       <w:r/>
       <w:r>
         <w:rPr>
@@ -157,9 +196,16 @@
     </w:p>
     <w:p>
       <w:pPr>
-        <w:pStyle w:val="ListNumber"/>
         <w:spacing w:after="80"/>
+        <w:ind w:left="576"/>
       </w:pPr>
+      <w:r>
+        <w:rPr>
+          <w:b/>
+          <w:color w:val="053364"/>
+        </w:rPr>
+        <w:t xml:space="preserve">2.  </w:t>
+      </w:r>
       <w:r/>
       <w:r>
         <w:rPr>
@@ -173,9 +219,16 @@
     </w:p>
     <w:p>
       <w:pPr>
-        <w:pStyle w:val="ListBullet"/>
         <w:spacing w:after="80"/>
+        <w:ind w:left="576"/>
       </w:pPr>
+      <w:r>
+        <w:rPr>
+          <w:b/>
+          <w:color w:val="0F172A"/>
+        </w:rPr>
+        <w:t xml:space="preserve">•  </w:t>
+      </w:r>
       <w:r/>
       <w:r>
         <w:rPr>
@@ -189,9 +242,16 @@
     </w:p>
     <w:p>
       <w:pPr>
-        <w:pStyle w:val="ListBullet"/>
         <w:spacing w:after="80"/>
+        <w:ind w:left="576"/>
       </w:pPr>
+      <w:r>
+        <w:rPr>
+          <w:b/>
+          <w:color w:val="0F172A"/>
+        </w:rPr>
+        <w:t xml:space="preserve">•  </w:t>
+      </w:r>
       <w:r/>
       <w:r>
         <w:rPr>
@@ -205,9 +265,16 @@
     </w:p>
     <w:p>
       <w:pPr>
-        <w:pStyle w:val="ListBullet"/>
         <w:spacing w:after="80"/>
+        <w:ind w:left="576"/>
       </w:pPr>
+      <w:r>
+        <w:rPr>
+          <w:b/>
+          <w:color w:val="0F172A"/>
+        </w:rPr>
+        <w:t xml:space="preserve">•  </w:t>
+      </w:r>
       <w:r/>
       <w:r>
         <w:rPr>
@@ -221,9 +288,16 @@
     </w:p>
     <w:p>
       <w:pPr>
-        <w:pStyle w:val="ListBullet"/>
         <w:spacing w:after="80"/>
+        <w:ind w:left="576"/>
       </w:pPr>
+      <w:r>
+        <w:rPr>
+          <w:b/>
+          <w:color w:val="0F172A"/>
+        </w:rPr>
+        <w:t xml:space="preserve">•  </w:t>
+      </w:r>
       <w:r/>
       <w:r>
         <w:rPr>
@@ -237,9 +311,16 @@
     </w:p>
     <w:p>
       <w:pPr>
-        <w:pStyle w:val="ListNumber"/>
         <w:spacing w:after="80"/>
+        <w:ind w:left="576"/>
       </w:pPr>
+      <w:r>
+        <w:rPr>
+          <w:b/>
+          <w:color w:val="053364"/>
+        </w:rPr>
+        <w:t xml:space="preserve">3.  </w:t>
+      </w:r>
       <w:r/>
       <w:r>
         <w:rPr>
@@ -253,9 +334,16 @@
     </w:p>
     <w:p>
       <w:pPr>
-        <w:pStyle w:val="ListBullet"/>
         <w:spacing w:after="80"/>
+        <w:ind w:left="576"/>
       </w:pPr>
+      <w:r>
+        <w:rPr>
+          <w:b/>
+          <w:color w:val="0F172A"/>
+        </w:rPr>
+        <w:t xml:space="preserve">•  </w:t>
+      </w:r>
       <w:r/>
       <w:r>
         <w:rPr>
@@ -269,9 +357,16 @@
     </w:p>
     <w:p>
       <w:pPr>
-        <w:pStyle w:val="ListNumber"/>
         <w:spacing w:after="80"/>
+        <w:ind w:left="576"/>
       </w:pPr>
+      <w:r>
+        <w:rPr>
+          <w:b/>
+          <w:color w:val="053364"/>
+        </w:rPr>
+        <w:t xml:space="preserve">4.  </w:t>
+      </w:r>
       <w:r/>
       <w:r>
         <w:rPr>
@@ -285,9 +380,16 @@
     </w:p>
     <w:p>
       <w:pPr>
-        <w:pStyle w:val="ListBullet"/>
         <w:spacing w:after="80"/>
+        <w:ind w:left="576"/>
       </w:pPr>
+      <w:r>
+        <w:rPr>
+          <w:b/>
+          <w:color w:val="0F172A"/>
+        </w:rPr>
+        <w:t xml:space="preserve">•  </w:t>
+      </w:r>
       <w:r/>
       <w:r>
         <w:rPr>
@@ -301,18 +403,20 @@
     </w:p>
     <w:p>
       <w:pPr>
+        <w:spacing w:before="240" w:after="240"/>
         <w:jc w:val="center"/>
       </w:pPr>
       <w:r>
         <w:rPr>
-          <w:color w:val="C8C8C8"/>
+          <w:color w:val="DCDCDC"/>
         </w:rPr>
-        <w:t>————————————————————————————————————————</w:t>
+        <w:t>——————————————————————————————————————————————————</w:t>
       </w:r>
     </w:p>
     <w:p>
       <w:pPr>
-        <w:spacing w:before="360" w:after="120"/>
+        <w:keepNext/>
+        <w:spacing w:before="360" w:after="160"/>
       </w:pPr>
       <w:r>
         <w:rPr>
@@ -327,7 +431,7 @@
     <w:p>
       <w:pPr>
         <w:spacing w:after="80"/>
-        <w:ind w:left="720"/>
+        <w:ind w:left="864"/>
       </w:pPr>
       <w:r>
         <w:rPr>
@@ -339,9 +443,16 @@
     </w:p>
     <w:p>
       <w:pPr>
-        <w:pStyle w:val="ListNumber"/>
         <w:spacing w:after="80"/>
+        <w:ind w:left="576"/>
       </w:pPr>
+      <w:r>
+        <w:rPr>
+          <w:b/>
+          <w:color w:val="053364"/>
+        </w:rPr>
+        <w:t xml:space="preserve">1.  </w:t>
+      </w:r>
       <w:r/>
       <w:r>
         <w:rPr>
@@ -355,9 +466,16 @@
     </w:p>
     <w:p>
       <w:pPr>
-        <w:pStyle w:val="ListNumber"/>
         <w:spacing w:after="80"/>
+        <w:ind w:left="576"/>
       </w:pPr>
+      <w:r>
+        <w:rPr>
+          <w:b/>
+          <w:color w:val="053364"/>
+        </w:rPr>
+        <w:t xml:space="preserve">2.  </w:t>
+      </w:r>
       <w:r/>
       <w:r>
         <w:rPr>
@@ -371,9 +489,16 @@
     </w:p>
     <w:p>
       <w:pPr>
-        <w:pStyle w:val="ListBullet"/>
         <w:spacing w:after="80"/>
+        <w:ind w:left="576"/>
       </w:pPr>
+      <w:r>
+        <w:rPr>
+          <w:b/>
+          <w:color w:val="0F172A"/>
+        </w:rPr>
+        <w:t xml:space="preserve">•  </w:t>
+      </w:r>
       <w:r/>
       <w:r>
         <w:rPr>
@@ -387,9 +512,16 @@
     </w:p>
     <w:p>
       <w:pPr>
-        <w:pStyle w:val="ListNumber"/>
         <w:spacing w:after="80"/>
+        <w:ind w:left="576"/>
       </w:pPr>
+      <w:r>
+        <w:rPr>
+          <w:b/>
+          <w:color w:val="053364"/>
+        </w:rPr>
+        <w:t xml:space="preserve">3.  </w:t>
+      </w:r>
       <w:r/>
       <w:r>
         <w:rPr>
@@ -403,9 +535,16 @@
     </w:p>
     <w:p>
       <w:pPr>
-        <w:pStyle w:val="ListBullet"/>
         <w:spacing w:after="80"/>
+        <w:ind w:left="576"/>
       </w:pPr>
+      <w:r>
+        <w:rPr>
+          <w:b/>
+          <w:color w:val="0F172A"/>
+        </w:rPr>
+        <w:t xml:space="preserve">•  </w:t>
+      </w:r>
       <w:r/>
       <w:r>
         <w:rPr>
@@ -419,9 +558,16 @@
     </w:p>
     <w:p>
       <w:pPr>
-        <w:pStyle w:val="ListNumber"/>
         <w:spacing w:after="80"/>
+        <w:ind w:left="576"/>
       </w:pPr>
+      <w:r>
+        <w:rPr>
+          <w:b/>
+          <w:color w:val="053364"/>
+        </w:rPr>
+        <w:t xml:space="preserve">4.  </w:t>
+      </w:r>
       <w:r/>
       <w:r>
         <w:rPr>
@@ -435,9 +581,16 @@
     </w:p>
     <w:p>
       <w:pPr>
-        <w:pStyle w:val="ListBullet"/>
         <w:spacing w:after="80"/>
+        <w:ind w:left="576"/>
       </w:pPr>
+      <w:r>
+        <w:rPr>
+          <w:b/>
+          <w:color w:val="0F172A"/>
+        </w:rPr>
+        <w:t xml:space="preserve">•  </w:t>
+      </w:r>
       <w:r/>
       <w:r>
         <w:rPr>
@@ -451,18 +604,20 @@
     </w:p>
     <w:p>
       <w:pPr>
+        <w:spacing w:before="240" w:after="240"/>
         <w:jc w:val="center"/>
       </w:pPr>
       <w:r>
         <w:rPr>
-          <w:color w:val="C8C8C8"/>
+          <w:color w:val="DCDCDC"/>
         </w:rPr>
-        <w:t>————————————————————————————————————————</w:t>
+        <w:t>——————————————————————————————————————————————————</w:t>
       </w:r>
     </w:p>
     <w:p>
       <w:pPr>
-        <w:spacing w:before="360" w:after="120"/>
+        <w:keepNext/>
+        <w:spacing w:before="360" w:after="160"/>
       </w:pPr>
       <w:r>
         <w:rPr>
@@ -477,7 +632,7 @@
     <w:p>
       <w:pPr>
         <w:spacing w:after="80"/>
-        <w:ind w:left="720"/>
+        <w:ind w:left="864"/>
       </w:pPr>
       <w:r>
         <w:rPr>
@@ -489,9 +644,16 @@
     </w:p>
     <w:p>
       <w:pPr>
-        <w:pStyle w:val="ListNumber"/>
         <w:spacing w:after="80"/>
+        <w:ind w:left="576"/>
       </w:pPr>
+      <w:r>
+        <w:rPr>
+          <w:b/>
+          <w:color w:val="053364"/>
+        </w:rPr>
+        <w:t xml:space="preserve">1.  </w:t>
+      </w:r>
       <w:r/>
       <w:r>
         <w:rPr>
@@ -505,9 +667,16 @@
     </w:p>
     <w:p>
       <w:pPr>
-        <w:pStyle w:val="ListNumber"/>
         <w:spacing w:after="80"/>
+        <w:ind w:left="576"/>
       </w:pPr>
+      <w:r>
+        <w:rPr>
+          <w:b/>
+          <w:color w:val="053364"/>
+        </w:rPr>
+        <w:t xml:space="preserve">2.  </w:t>
+      </w:r>
       <w:r/>
       <w:r>
         <w:rPr>
@@ -521,9 +690,16 @@
     </w:p>
     <w:p>
       <w:pPr>
-        <w:pStyle w:val="ListBullet"/>
         <w:spacing w:after="80"/>
+        <w:ind w:left="576"/>
       </w:pPr>
+      <w:r>
+        <w:rPr>
+          <w:b/>
+          <w:color w:val="0F172A"/>
+        </w:rPr>
+        <w:t xml:space="preserve">•  </w:t>
+      </w:r>
       <w:r/>
       <w:r>
         <w:rPr>
@@ -537,9 +713,16 @@
     </w:p>
     <w:p>
       <w:pPr>
-        <w:pStyle w:val="ListNumber"/>
         <w:spacing w:after="80"/>
+        <w:ind w:left="576"/>
       </w:pPr>
+      <w:r>
+        <w:rPr>
+          <w:b/>
+          <w:color w:val="053364"/>
+        </w:rPr>
+        <w:t xml:space="preserve">3.  </w:t>
+      </w:r>
       <w:r/>
       <w:r>
         <w:rPr>
@@ -553,9 +736,16 @@
     </w:p>
     <w:p>
       <w:pPr>
-        <w:pStyle w:val="ListBullet"/>
         <w:spacing w:after="80"/>
+        <w:ind w:left="576"/>
       </w:pPr>
+      <w:r>
+        <w:rPr>
+          <w:b/>
+          <w:color w:val="0F172A"/>
+        </w:rPr>
+        <w:t xml:space="preserve">•  </w:t>
+      </w:r>
       <w:r/>
       <w:r>
         <w:rPr>
@@ -569,9 +759,16 @@
     </w:p>
     <w:p>
       <w:pPr>
-        <w:pStyle w:val="ListNumber"/>
         <w:spacing w:after="80"/>
+        <w:ind w:left="576"/>
       </w:pPr>
+      <w:r>
+        <w:rPr>
+          <w:b/>
+          <w:color w:val="053364"/>
+        </w:rPr>
+        <w:t xml:space="preserve">4.  </w:t>
+      </w:r>
       <w:r/>
       <w:r>
         <w:rPr>
@@ -585,9 +782,16 @@
     </w:p>
     <w:p>
       <w:pPr>
-        <w:pStyle w:val="ListBullet"/>
         <w:spacing w:after="80"/>
+        <w:ind w:left="576"/>
       </w:pPr>
+      <w:r>
+        <w:rPr>
+          <w:b/>
+          <w:color w:val="0F172A"/>
+        </w:rPr>
+        <w:t xml:space="preserve">•  </w:t>
+      </w:r>
       <w:r/>
       <w:r>
         <w:rPr>
@@ -601,18 +805,20 @@
     </w:p>
     <w:p>
       <w:pPr>
+        <w:spacing w:before="240" w:after="240"/>
         <w:jc w:val="center"/>
       </w:pPr>
       <w:r>
         <w:rPr>
-          <w:color w:val="C8C8C8"/>
+          <w:color w:val="DCDCDC"/>
         </w:rPr>
-        <w:t>————————————————————————————————————————</w:t>
+        <w:t>——————————————————————————————————————————————————</w:t>
       </w:r>
     </w:p>
     <w:p>
       <w:pPr>
-        <w:spacing w:before="360" w:after="120"/>
+        <w:keepNext/>
+        <w:spacing w:before="360" w:after="160"/>
       </w:pPr>
       <w:r>
         <w:rPr>
@@ -626,9 +832,16 @@
     </w:p>
     <w:p>
       <w:pPr>
-        <w:pStyle w:val="ListNumber"/>
         <w:spacing w:after="80"/>
+        <w:ind w:left="576"/>
       </w:pPr>
+      <w:r>
+        <w:rPr>
+          <w:b/>
+          <w:color w:val="053364"/>
+        </w:rPr>
+        <w:t xml:space="preserve">1.  </w:t>
+      </w:r>
       <w:r/>
       <w:r>
         <w:rPr>
@@ -642,9 +855,16 @@
     </w:p>
     <w:p>
       <w:pPr>
-        <w:pStyle w:val="ListNumber"/>
         <w:spacing w:after="80"/>
+        <w:ind w:left="576"/>
       </w:pPr>
+      <w:r>
+        <w:rPr>
+          <w:b/>
+          <w:color w:val="053364"/>
+        </w:rPr>
+        <w:t xml:space="preserve">2.  </w:t>
+      </w:r>
       <w:r/>
       <w:r>
         <w:rPr>
@@ -658,7 +878,7 @@
     </w:p>
     <w:sectPr>
       <w:pgSz w:w="12240" w:h="15840"/>
-      <w:pgMar w:top="1440" w:right="1800" w:bottom="1440" w:left="1800" w:header="720" w:footer="720" w:gutter="0"/>
+      <w:pgMar w:top="1440" w:right="1440" w:bottom="1440" w:left="1440" w:header="720" w:footer="720" w:gutter="0"/>
       <w:cols w:space="720"/>
       <w:docGrid w:linePitch="360"/>
     </w:sectPr>

</xml_diff>